<commit_message>
Close out citations: derive premium shelf (1.3M), add Sources section
- Ceiling denominator: replace 3.0M placeholder with derived ~1.3M
  premium machines/yr = $1.12B super-automatic bean-to-cup
  (DataHorizzon, 2024) / ~$850 blended ASP. Ceiling moves 1.0% -> 2.4%
  (still a low-single-digit slice).
- Add a Sources & citations section to the calculator and one-pager
  (docx + pdf): three market anchors verified against named firms
  (Fortune Business Insights, DataHorizzon, Market.us/Fact.MR), plus the
  derived-shelf arithmetic and ASP basis.
- README: shelf now derived-and-cited; add verified market-anchor table.

Sourcing only; no model figures changed.

Co-Authored-By: Claude Opus 4.8 <noreply@anthropic.com>
Claude-Session: https://claude.ai/code/session_01Nn9Fs6189BujfunnEVgdza
</commit_message>
<xml_diff>
--- a/caffevolve/royalty-model-onepager.docx
+++ b/caffevolve/royalty-model-onepager.docx
@@ -2177,7 +2177,7 @@
           <w:sz w:val="18"/>
           <w:szCs w:val="18"/>
         </w:rPr>
-        <w:t xml:space="preserve">Year-5 total units — 9,500 commercial + 21,812 seeded consumer = 31,312 — against a premium appliance shelf of 3,000,000 units/yr = </w:t>
+        <w:t xml:space="preserve">Year-5 total units — 9,500 commercial + 21,812 seeded consumer = 31,312 — against a premium appliance shelf of 1,300,000 units/yr = </w:t>
       </w:r>
       <w:r>
         <w:rPr>
@@ -2188,7 +2188,7 @@
           <w:sz w:val="18"/>
           <w:szCs w:val="18"/>
         </w:rPr>
-        <w:t xml:space="preserve">1.0% </w:t>
+        <w:t xml:space="preserve">2.4% </w:t>
       </w:r>
       <w:r>
         <w:rPr>
@@ -2196,7 +2196,7 @@
           <w:sz w:val="18"/>
           <w:szCs w:val="18"/>
         </w:rPr>
-        <w:t xml:space="preserve">of shelf — a credible low-single-digit slice. Shelf figure is a placeholder; state your cited source.</w:t>
+        <w:t xml:space="preserve">of shelf — a credible low-single-digit slice. Shelf is a derived figure (see Sources).</w:t>
       </w:r>
     </w:p>
     <w:p>
@@ -2300,6 +2300,136 @@
           <w:szCs w:val="18"/>
         </w:rPr>
         <w:t xml:space="preserve">MSRP tiers, net-wholesale basis, and the 5/7/8 royalty band.</w:t>
+      </w:r>
+    </w:p>
+    <w:p>
+      <w:pPr>
+        <w:spacing w:after="40" w:before="230"/>
+      </w:pPr>
+      <w:r>
+        <w:rPr>
+          <w:rFonts w:ascii="Calibri" w:cs="Calibri" w:eastAsia="Calibri" w:hAnsi="Calibri"/>
+          <w:b/>
+          <w:bCs/>
+          <w:color w:val="1A1A1A"/>
+          <w:sz w:val="21"/>
+          <w:szCs w:val="21"/>
+        </w:rPr>
+        <w:t xml:space="preserve">Sources &amp; citations</w:t>
+      </w:r>
+    </w:p>
+    <w:p>
+      <w:pPr>
+        <w:spacing w:after="110"/>
+      </w:pPr>
+      <w:r>
+        <w:rPr>
+          <w:rFonts w:ascii="Calibri" w:cs="Calibri" w:eastAsia="Calibri" w:hAnsi="Calibri"/>
+          <w:color w:val="6B5B4A"/>
+          <w:sz w:val="14"/>
+          <w:szCs w:val="14"/>
+        </w:rPr>
+        <w:t xml:space="preserve">Market anchors verified against named research firms (Sep 2026). The ceiling denominator is a derived figure — dollar size ÷ ASP — labeled as such.</w:t>
+      </w:r>
+    </w:p>
+    <w:p>
+      <w:pPr>
+        <w:spacing w:after="70"/>
+      </w:pPr>
+      <w:r>
+        <w:rPr>
+          <w:rFonts w:ascii="Calibri" w:cs="Calibri" w:eastAsia="Calibri" w:hAnsi="Calibri"/>
+          <w:b/>
+          <w:bCs/>
+          <w:color w:val="1A1A1A"/>
+          <w:sz w:val="14"/>
+          <w:szCs w:val="14"/>
+        </w:rPr>
+        <w:t xml:space="preserve">Premium espresso + capsule (global) — $7.40B (2025), CAGR 5.08% (2026–34). </w:t>
+      </w:r>
+      <w:r>
+        <w:rPr>
+          <w:rFonts w:ascii="Calibri" w:cs="Calibri" w:eastAsia="Calibri" w:hAnsi="Calibri"/>
+          <w:color w:val="5A4636"/>
+          <w:sz w:val="14"/>
+          <w:szCs w:val="14"/>
+        </w:rPr>
+        <w:t xml:space="preserve">Fortune Business Insights, Espresso Machine &amp; Capsule Coffee Machine Market (rpt 117856); espresso + capsule, residential + commercial; US 2025 $1.34B. fortunebusinessinsights.com/espresso-machine-and-capsule-coffee-machine-market-117856</w:t>
+      </w:r>
+    </w:p>
+    <w:p>
+      <w:pPr>
+        <w:spacing w:after="70"/>
+      </w:pPr>
+      <w:r>
+        <w:rPr>
+          <w:rFonts w:ascii="Calibri" w:cs="Calibri" w:eastAsia="Calibri" w:hAnsi="Calibri"/>
+          <w:b/>
+          <w:bCs/>
+          <w:color w:val="1A1A1A"/>
+          <w:sz w:val="14"/>
+          <w:szCs w:val="14"/>
+        </w:rPr>
+        <w:t xml:space="preserve">Super-automatic bean-to-cup (global) — $1.12B (2024), CAGR 7.2% (2025–33). </w:t>
+      </w:r>
+      <w:r>
+        <w:rPr>
+          <w:rFonts w:ascii="Calibri" w:cs="Calibri" w:eastAsia="Calibri" w:hAnsi="Calibri"/>
+          <w:color w:val="5A4636"/>
+          <w:sz w:val="14"/>
+          <w:szCs w:val="14"/>
+        </w:rPr>
+        <w:t xml:space="preserve">DataHorizzon Research, Bean to Cup Coffee Machines Market (27133); residential + commercial. datahorizzonresearch.com/bean-to-cup-coffee-machines-market-27133</w:t>
+      </w:r>
+    </w:p>
+    <w:p>
+      <w:pPr>
+        <w:spacing w:after="70"/>
+      </w:pPr>
+      <w:r>
+        <w:rPr>
+          <w:rFonts w:ascii="Calibri" w:cs="Calibri" w:eastAsia="Calibri" w:hAnsi="Calibri"/>
+          <w:b/>
+          <w:bCs/>
+          <w:color w:val="1A1A1A"/>
+          <w:sz w:val="14"/>
+          <w:szCs w:val="14"/>
+        </w:rPr>
+        <w:t xml:space="preserve">Connected / “smart” (global) — ~$0.4–6.8B range, not cleanly tracked. </w:t>
+      </w:r>
+      <w:r>
+        <w:rPr>
+          <w:rFonts w:ascii="Calibri" w:cs="Calibri" w:eastAsia="Calibri" w:hAnsi="Calibri"/>
+          <w:color w:val="5A4636"/>
+          <w:sz w:val="14"/>
+          <w:szCs w:val="14"/>
+        </w:rPr>
+        <w:t xml:space="preserve">Market.us $396.4M (2023, 16.6%) at the low end; Fact.MR $6.8B (2023 → $10.5B 2033, 4.5%) at the high end; Market Glass / ResearchAndMarkets in between. ~17× spread, definition-driven. market.us/report/smart-coffee-maker-market/</w:t>
+      </w:r>
+    </w:p>
+    <w:p>
+      <w:pPr>
+        <w:spacing w:after="70"/>
+      </w:pPr>
+      <w:r>
+        <w:rPr>
+          <w:rFonts w:ascii="Calibri" w:cs="Calibri" w:eastAsia="Calibri" w:hAnsi="Calibri"/>
+          <w:b/>
+          <w:bCs/>
+          <w:color w:val="1A1A1A"/>
+          <w:sz w:val="14"/>
+          <w:szCs w:val="14"/>
+        </w:rPr>
+        <w:t xml:space="preserve">Ceiling denominator — premium shelf ≈ 1.3M units/yr (global) · DERIVED. </w:t>
+      </w:r>
+      <w:r>
+        <w:rPr>
+          <w:rFonts w:ascii="Calibri" w:cs="Calibri" w:eastAsia="Calibri" w:hAnsi="Calibri"/>
+          <w:color w:val="5A4636"/>
+          <w:sz w:val="14"/>
+          <w:szCs w:val="14"/>
+        </w:rPr>
+        <w:t xml:space="preserve">$1.12B super-automatic bean-to-cup (DataHorizzon, 2024) ÷ ~$850 blended consumer ASP (bean-to-cup retail ~$385–$2,500; De’Longhi PrimaDonna $2,499.95) ≈ 1.3M units/yr. Order-of-magnitude guardrail (range ~1.1–1.6M at $700–$1,000 ASP); not a found unit count.</w:t>
       </w:r>
     </w:p>
     <w:p>

</xml_diff>